<commit_message>
Se comenzo a calcular el incremento debido al uso de genotipos.
</commit_message>
<xml_diff>
--- a/Resultados.docx
+++ b/Resultados.docx
@@ -52178,7 +52178,35 @@
           <w:sz w:val="24"/>
           <w:szCs w:val="24"/>
         </w:rPr>
-        <w:t>Tabla 1.</w:t>
+        <w:t>Tabla 1</w:t>
+      </w:r>
+      <w:r>
+        <w:rPr>
+          <w:b/>
+          <w:bCs/>
+          <w:i w:val="false"/>
+          <w:caps w:val="false"/>
+          <w:smallCaps w:val="false"/>
+          <w:color w:val="000000"/>
+          <w:spacing w:val="0"/>
+          <w:sz w:val="24"/>
+          <w:szCs w:val="24"/>
+        </w:rPr>
+        <w:t>0</w:t>
+      </w:r>
+      <w:r>
+        <w:rPr>
+          <w:b/>
+          <w:bCs/>
+          <w:i w:val="false"/>
+          <w:caps w:val="false"/>
+          <w:smallCaps w:val="false"/>
+          <w:color w:val="000000"/>
+          <w:spacing w:val="0"/>
+          <w:sz w:val="24"/>
+          <w:szCs w:val="24"/>
+        </w:rPr>
+        <w:t>.</w:t>
       </w:r>
       <w:r>
         <w:rPr>
@@ -53287,7 +53315,24 @@
                 <w:szCs w:val="24"/>
                 <w:u w:val="none"/>
               </w:rPr>
-              <w:t>0.09377</w:t>
+              <w:t>0.09</w:t>
+            </w:r>
+            <w:r>
+              <w:rPr>
+                <w:b w:val="false"/>
+                <w:bCs w:val="false"/>
+                <w:i w:val="false"/>
+                <w:iCs w:val="false"/>
+                <w:strike w:val="false"/>
+                <w:dstrike w:val="false"/>
+                <w:outline w:val="false"/>
+                <w:shadow w:val="false"/>
+                <w:color w:val="000000"/>
+                <w:sz w:val="24"/>
+                <w:szCs w:val="24"/>
+                <w:u w:val="none"/>
+              </w:rPr>
+              <w:t>566</w:t>
             </w:r>
           </w:p>
         </w:tc>
@@ -53431,7 +53476,24 @@
                 <w:szCs w:val="24"/>
                 <w:u w:val="none"/>
               </w:rPr>
-              <w:t>0.10203</w:t>
+              <w:t>0.10</w:t>
+            </w:r>
+            <w:r>
+              <w:rPr>
+                <w:b w:val="false"/>
+                <w:bCs w:val="false"/>
+                <w:i w:val="false"/>
+                <w:iCs w:val="false"/>
+                <w:strike w:val="false"/>
+                <w:dstrike w:val="false"/>
+                <w:outline w:val="false"/>
+                <w:shadow w:val="false"/>
+                <w:color w:val="000000"/>
+                <w:sz w:val="24"/>
+                <w:szCs w:val="24"/>
+                <w:u w:val="none"/>
+              </w:rPr>
+              <w:t>350</w:t>
             </w:r>
           </w:p>
         </w:tc>
@@ -53575,7 +53637,24 @@
                 <w:szCs w:val="24"/>
                 <w:u w:val="none"/>
               </w:rPr>
-              <w:t>0.09013</w:t>
+              <w:t>0.0</w:t>
+            </w:r>
+            <w:r>
+              <w:rPr>
+                <w:b w:val="false"/>
+                <w:bCs w:val="false"/>
+                <w:i w:val="false"/>
+                <w:iCs w:val="false"/>
+                <w:strike w:val="false"/>
+                <w:dstrike w:val="false"/>
+                <w:outline w:val="false"/>
+                <w:shadow w:val="false"/>
+                <w:color w:val="000000"/>
+                <w:sz w:val="24"/>
+                <w:szCs w:val="24"/>
+                <w:u w:val="none"/>
+              </w:rPr>
+              <w:t>8977</w:t>
             </w:r>
           </w:p>
         </w:tc>
@@ -53723,7 +53802,24 @@
                 <w:szCs w:val="24"/>
                 <w:u w:val="none"/>
               </w:rPr>
-              <w:t>0.09773</w:t>
+              <w:t>0.09</w:t>
+            </w:r>
+            <w:r>
+              <w:rPr>
+                <w:b w:val="false"/>
+                <w:bCs w:val="false"/>
+                <w:i w:val="false"/>
+                <w:iCs w:val="false"/>
+                <w:strike w:val="false"/>
+                <w:dstrike w:val="false"/>
+                <w:outline w:val="false"/>
+                <w:shadow w:val="false"/>
+                <w:color w:val="000000"/>
+                <w:sz w:val="24"/>
+                <w:szCs w:val="24"/>
+                <w:u w:val="none"/>
+              </w:rPr>
+              <w:t>655</w:t>
             </w:r>
           </w:p>
         </w:tc>
@@ -54321,13 +54417,14 @@
       <w:pPr>
         <w:pStyle w:val="Normal"/>
         <w:bidi w:val="0"/>
-        <w:jc w:val="left"/>
+        <w:spacing w:before="0" w:after="0"/>
+        <w:jc w:val="both"/>
         <w:rPr/>
       </w:pPr>
       <w:r>
         <w:rPr/>
         <w:drawing>
-          <wp:anchor behindDoc="0" distT="0" distB="0" distL="0" distR="0" simplePos="0" locked="0" layoutInCell="0" allowOverlap="1" relativeHeight="2">
+          <wp:anchor behindDoc="0" distT="0" distB="0" distL="0" distR="0" simplePos="0" locked="0" layoutInCell="0" allowOverlap="1" relativeHeight="245">
             <wp:simplePos x="0" y="0"/>
             <wp:positionH relativeFrom="column">
               <wp:align>center</wp:align>
@@ -54338,7 +54435,7 @@
             <wp:extent cx="6120130" cy="3055620"/>
             <wp:effectExtent l="0" t="0" r="0" b="0"/>
             <wp:wrapSquare wrapText="largest"/>
-            <wp:docPr id="1" name="Imagen1" descr=""/>
+            <wp:docPr id="1" name="Imagen6" descr=""/>
             <wp:cNvGraphicFramePr>
               <a:graphicFrameLocks xmlns:a="http://schemas.openxmlformats.org/drawingml/2006/main" noChangeAspect="1"/>
             </wp:cNvGraphicFramePr>
@@ -54346,7 +54443,7 @@
               <a:graphicData uri="http://schemas.openxmlformats.org/drawingml/2006/picture">
                 <pic:pic xmlns:pic="http://schemas.openxmlformats.org/drawingml/2006/picture">
                   <pic:nvPicPr>
-                    <pic:cNvPr id="1" name="Imagen1" descr=""/>
+                    <pic:cNvPr id="1" name="Imagen6" descr=""/>
                     <pic:cNvPicPr>
                       <a:picLocks noChangeAspect="1" noChangeArrowheads="1"/>
                     </pic:cNvPicPr>
@@ -54475,7 +54572,7 @@
           <w:sz w:val="24"/>
           <w:szCs w:val="24"/>
         </w:rPr>
-        <w:t>2</w:t>
+        <w:t>11</w:t>
       </w:r>
       <w:r>
         <w:rPr>
@@ -55815,7 +55912,7 @@
                 <w:szCs w:val="24"/>
                 <w:u w:val="none"/>
               </w:rPr>
-              <w:t>2898</w:t>
+              <w:t>7242</w:t>
             </w:r>
           </w:p>
         </w:tc>
@@ -55993,7 +56090,24 @@
                 <w:szCs w:val="24"/>
                 <w:u w:val="none"/>
               </w:rPr>
-              <w:t>02758</w:t>
+              <w:t>0</w:t>
+            </w:r>
+            <w:r>
+              <w:rPr>
+                <w:b w:val="false"/>
+                <w:bCs w:val="false"/>
+                <w:i w:val="false"/>
+                <w:iCs w:val="false"/>
+                <w:strike w:val="false"/>
+                <w:dstrike w:val="false"/>
+                <w:outline w:val="false"/>
+                <w:shadow w:val="false"/>
+                <w:color w:val="000000"/>
+                <w:sz w:val="24"/>
+                <w:szCs w:val="24"/>
+                <w:u w:val="none"/>
+              </w:rPr>
+              <w:t>6926</w:t>
             </w:r>
           </w:p>
         </w:tc>
@@ -56171,7 +56285,24 @@
                 <w:szCs w:val="24"/>
                 <w:u w:val="none"/>
               </w:rPr>
-              <w:t>02814</w:t>
+              <w:t>0</w:t>
+            </w:r>
+            <w:r>
+              <w:rPr>
+                <w:b w:val="false"/>
+                <w:bCs w:val="false"/>
+                <w:i w:val="false"/>
+                <w:iCs w:val="false"/>
+                <w:strike w:val="false"/>
+                <w:dstrike w:val="false"/>
+                <w:outline w:val="false"/>
+                <w:shadow w:val="false"/>
+                <w:color w:val="000000"/>
+                <w:sz w:val="24"/>
+                <w:szCs w:val="24"/>
+                <w:u w:val="none"/>
+              </w:rPr>
+              <w:t>6809</w:t>
             </w:r>
           </w:p>
         </w:tc>
@@ -56353,7 +56484,7 @@
                 <w:szCs w:val="24"/>
                 <w:u w:val="none"/>
               </w:rPr>
-              <w:t>2877</w:t>
+              <w:t>7108</w:t>
             </w:r>
           </w:p>
         </w:tc>
@@ -56986,13 +57117,36 @@
       <w:pPr>
         <w:pStyle w:val="Normal"/>
         <w:bidi w:val="0"/>
-        <w:jc w:val="left"/>
-        <w:rPr/>
+        <w:spacing w:before="0" w:after="0"/>
+        <w:jc w:val="both"/>
+        <w:rPr>
+          <w:rFonts w:ascii="Liberation Serif" w:hAnsi="Liberation Serif"/>
+          <w:b w:val="false"/>
+          <w:b w:val="false"/>
+          <w:bCs w:val="false"/>
+          <w:i w:val="false"/>
+          <w:caps w:val="false"/>
+          <w:smallCaps w:val="false"/>
+          <w:color w:val="000000"/>
+          <w:spacing w:val="0"/>
+          <w:sz w:val="20"/>
+          <w:szCs w:val="20"/>
+        </w:rPr>
       </w:pPr>
       <w:r>
-        <w:rPr/>
+        <w:rPr>
+          <w:b w:val="false"/>
+          <w:bCs w:val="false"/>
+          <w:i w:val="false"/>
+          <w:caps w:val="false"/>
+          <w:smallCaps w:val="false"/>
+          <w:color w:val="000000"/>
+          <w:spacing w:val="0"/>
+          <w:sz w:val="20"/>
+          <w:szCs w:val="20"/>
+        </w:rPr>
         <w:drawing>
-          <wp:anchor behindDoc="0" distT="0" distB="0" distL="0" distR="0" simplePos="0" locked="0" layoutInCell="0" allowOverlap="1" relativeHeight="3">
+          <wp:anchor behindDoc="0" distT="0" distB="0" distL="0" distR="0" simplePos="0" locked="0" layoutInCell="0" allowOverlap="1" relativeHeight="246">
             <wp:simplePos x="0" y="0"/>
             <wp:positionH relativeFrom="column">
               <wp:align>center</wp:align>
@@ -57003,7 +57157,7 @@
             <wp:extent cx="6120130" cy="3055620"/>
             <wp:effectExtent l="0" t="0" r="0" b="0"/>
             <wp:wrapSquare wrapText="largest"/>
-            <wp:docPr id="2" name="Imagen2" descr=""/>
+            <wp:docPr id="2" name="Imagen1" descr=""/>
             <wp:cNvGraphicFramePr>
               <a:graphicFrameLocks xmlns:a="http://schemas.openxmlformats.org/drawingml/2006/main" noChangeAspect="1"/>
             </wp:cNvGraphicFramePr>
@@ -57011,7 +57165,7 @@
               <a:graphicData uri="http://schemas.openxmlformats.org/drawingml/2006/picture">
                 <pic:pic xmlns:pic="http://schemas.openxmlformats.org/drawingml/2006/picture">
                   <pic:nvPicPr>
-                    <pic:cNvPr id="2" name="Imagen2" descr=""/>
+                    <pic:cNvPr id="2" name="Imagen1" descr=""/>
                     <pic:cNvPicPr>
                       <a:picLocks noChangeAspect="1" noChangeArrowheads="1"/>
                     </pic:cNvPicPr>
@@ -57140,6 +57294,20 @@
           <w:sz w:val="24"/>
           <w:szCs w:val="24"/>
         </w:rPr>
+        <w:t>1</w:t>
+      </w:r>
+      <w:r>
+        <w:rPr>
+          <w:b/>
+          <w:bCs/>
+          <w:i w:val="false"/>
+          <w:caps w:val="false"/>
+          <w:smallCaps w:val="false"/>
+          <w:color w:val="000000"/>
+          <w:spacing w:val="0"/>
+          <w:sz w:val="24"/>
+          <w:szCs w:val="24"/>
+        </w:rPr>
         <w:t>2</w:t>
       </w:r>
       <w:r>
@@ -59285,7 +59453,24 @@
                 <w:szCs w:val="24"/>
                 <w:u w:val="none"/>
               </w:rPr>
-              <w:t>4906</w:t>
+              <w:t>49</w:t>
+            </w:r>
+            <w:r>
+              <w:rPr>
+                <w:b w:val="false"/>
+                <w:bCs w:val="false"/>
+                <w:i w:val="false"/>
+                <w:iCs w:val="false"/>
+                <w:strike w:val="false"/>
+                <w:dstrike w:val="false"/>
+                <w:outline w:val="false"/>
+                <w:shadow w:val="false"/>
+                <w:color w:val="000000"/>
+                <w:sz w:val="24"/>
+                <w:szCs w:val="24"/>
+                <w:u w:val="none"/>
+              </w:rPr>
+              <w:t>49</w:t>
             </w:r>
           </w:p>
         </w:tc>
@@ -59396,7 +59581,24 @@
                 <w:szCs w:val="24"/>
                 <w:u w:val="none"/>
               </w:rPr>
-              <w:t>0.03973</w:t>
+              <w:t>0.0</w:t>
+            </w:r>
+            <w:r>
+              <w:rPr>
+                <w:b w:val="false"/>
+                <w:bCs w:val="false"/>
+                <w:i w:val="false"/>
+                <w:iCs w:val="false"/>
+                <w:strike w:val="false"/>
+                <w:dstrike w:val="false"/>
+                <w:outline w:val="false"/>
+                <w:shadow w:val="false"/>
+                <w:color w:val="000000"/>
+                <w:sz w:val="24"/>
+                <w:szCs w:val="24"/>
+                <w:u w:val="none"/>
+              </w:rPr>
+              <w:t>4060</w:t>
             </w:r>
           </w:p>
         </w:tc>
@@ -59557,7 +59759,24 @@
                 <w:szCs w:val="24"/>
                 <w:u w:val="none"/>
               </w:rPr>
-              <w:t>06989</w:t>
+              <w:t>0</w:t>
+            </w:r>
+            <w:r>
+              <w:rPr>
+                <w:b w:val="false"/>
+                <w:bCs w:val="false"/>
+                <w:i w:val="false"/>
+                <w:iCs w:val="false"/>
+                <w:strike w:val="false"/>
+                <w:dstrike w:val="false"/>
+                <w:outline w:val="false"/>
+                <w:shadow w:val="false"/>
+                <w:color w:val="000000"/>
+                <w:sz w:val="24"/>
+                <w:szCs w:val="24"/>
+                <w:u w:val="none"/>
+              </w:rPr>
+              <w:t>5422</w:t>
             </w:r>
           </w:p>
         </w:tc>
@@ -59702,7 +59921,24 @@
                 <w:szCs w:val="24"/>
                 <w:u w:val="none"/>
               </w:rPr>
-              <w:t>02313</w:t>
+              <w:t>023</w:t>
+            </w:r>
+            <w:r>
+              <w:rPr>
+                <w:b w:val="false"/>
+                <w:bCs w:val="false"/>
+                <w:i w:val="false"/>
+                <w:iCs w:val="false"/>
+                <w:strike w:val="false"/>
+                <w:dstrike w:val="false"/>
+                <w:outline w:val="false"/>
+                <w:shadow w:val="false"/>
+                <w:color w:val="000000"/>
+                <w:sz w:val="24"/>
+                <w:szCs w:val="24"/>
+                <w:u w:val="none"/>
+              </w:rPr>
+              <w:t>32</w:t>
             </w:r>
           </w:p>
         </w:tc>
@@ -59863,7 +60099,24 @@
                 <w:szCs w:val="24"/>
                 <w:u w:val="none"/>
               </w:rPr>
-              <w:t>06989</w:t>
+              <w:t>0</w:t>
+            </w:r>
+            <w:r>
+              <w:rPr>
+                <w:b w:val="false"/>
+                <w:bCs w:val="false"/>
+                <w:i w:val="false"/>
+                <w:iCs w:val="false"/>
+                <w:strike w:val="false"/>
+                <w:dstrike w:val="false"/>
+                <w:outline w:val="false"/>
+                <w:shadow w:val="false"/>
+                <w:color w:val="000000"/>
+                <w:sz w:val="24"/>
+                <w:szCs w:val="24"/>
+                <w:u w:val="none"/>
+              </w:rPr>
+              <w:t>7085</w:t>
             </w:r>
           </w:p>
         </w:tc>
@@ -59957,7 +60210,24 @@
                 <w:szCs w:val="24"/>
                 <w:u w:val="none"/>
               </w:rPr>
-              <w:t>-0.02803</w:t>
+              <w:t>-0.0</w:t>
+            </w:r>
+            <w:r>
+              <w:rPr>
+                <w:b w:val="false"/>
+                <w:bCs w:val="false"/>
+                <w:i w:val="false"/>
+                <w:iCs w:val="false"/>
+                <w:strike w:val="false"/>
+                <w:dstrike w:val="false"/>
+                <w:outline w:val="false"/>
+                <w:shadow w:val="false"/>
+                <w:color w:val="000000"/>
+                <w:sz w:val="24"/>
+                <w:szCs w:val="24"/>
+                <w:u w:val="none"/>
+              </w:rPr>
+              <w:t>4046</w:t>
             </w:r>
           </w:p>
         </w:tc>
@@ -60122,7 +60392,24 @@
                 <w:szCs w:val="24"/>
                 <w:u w:val="none"/>
               </w:rPr>
-              <w:t>5750</w:t>
+              <w:t>57</w:t>
+            </w:r>
+            <w:r>
+              <w:rPr>
+                <w:b w:val="false"/>
+                <w:bCs w:val="false"/>
+                <w:i w:val="false"/>
+                <w:iCs w:val="false"/>
+                <w:strike w:val="false"/>
+                <w:dstrike w:val="false"/>
+                <w:outline w:val="false"/>
+                <w:shadow w:val="false"/>
+                <w:color w:val="000000"/>
+                <w:sz w:val="24"/>
+                <w:szCs w:val="24"/>
+                <w:u w:val="none"/>
+              </w:rPr>
+              <w:t>49</w:t>
             </w:r>
           </w:p>
         </w:tc>
@@ -60237,7 +60524,24 @@
                 <w:szCs w:val="24"/>
                 <w:u w:val="none"/>
               </w:rPr>
-              <w:t>0.02536</w:t>
+              <w:t>0.0</w:t>
+            </w:r>
+            <w:r>
+              <w:rPr>
+                <w:b w:val="false"/>
+                <w:bCs w:val="false"/>
+                <w:i w:val="false"/>
+                <w:iCs w:val="false"/>
+                <w:strike w:val="false"/>
+                <w:dstrike w:val="false"/>
+                <w:outline w:val="false"/>
+                <w:shadow w:val="false"/>
+                <w:color w:val="000000"/>
+                <w:sz w:val="24"/>
+                <w:szCs w:val="24"/>
+                <w:u w:val="none"/>
+              </w:rPr>
+              <w:t>3584</w:t>
             </w:r>
           </w:p>
         </w:tc>
@@ -60778,8 +61082,19 @@
       </w:pPr>
       <w:r>
         <w:rPr/>
+      </w:r>
+    </w:p>
+    <w:p>
+      <w:pPr>
+        <w:pStyle w:val="Normal"/>
+        <w:bidi w:val="0"/>
+        <w:jc w:val="left"/>
+        <w:rPr/>
+      </w:pPr>
+      <w:r>
+        <w:rPr/>
         <w:drawing>
-          <wp:anchor behindDoc="0" distT="0" distB="0" distL="0" distR="0" simplePos="0" locked="0" layoutInCell="0" allowOverlap="1" relativeHeight="4">
+          <wp:anchor behindDoc="0" distT="0" distB="0" distL="0" distR="0" simplePos="0" locked="0" layoutInCell="0" allowOverlap="1" relativeHeight="247">
             <wp:simplePos x="0" y="0"/>
             <wp:positionH relativeFrom="column">
               <wp:align>center</wp:align>
@@ -60790,7 +61105,7 @@
             <wp:extent cx="6120130" cy="3055620"/>
             <wp:effectExtent l="0" t="0" r="0" b="0"/>
             <wp:wrapSquare wrapText="largest"/>
-            <wp:docPr id="3" name="Imagen3" descr=""/>
+            <wp:docPr id="3" name="Imagen2" descr=""/>
             <wp:cNvGraphicFramePr>
               <a:graphicFrameLocks xmlns:a="http://schemas.openxmlformats.org/drawingml/2006/main" noChangeAspect="1"/>
             </wp:cNvGraphicFramePr>
@@ -60798,7 +61113,7 @@
               <a:graphicData uri="http://schemas.openxmlformats.org/drawingml/2006/picture">
                 <pic:pic xmlns:pic="http://schemas.openxmlformats.org/drawingml/2006/picture">
                   <pic:nvPicPr>
-                    <pic:cNvPr id="3" name="Imagen3" descr=""/>
+                    <pic:cNvPr id="3" name="Imagen2" descr=""/>
                     <pic:cNvPicPr>
                       <a:picLocks noChangeAspect="1" noChangeArrowheads="1"/>
                     </pic:cNvPicPr>
@@ -60829,23 +61144,8 @@
       <w:pPr>
         <w:pStyle w:val="Normal"/>
         <w:bidi w:val="0"/>
-        <w:jc w:val="left"/>
+        <w:jc w:val="both"/>
         <w:rPr/>
-      </w:pPr>
-      <w:r>
-        <w:rPr/>
-      </w:r>
-    </w:p>
-    <w:p>
-      <w:pPr>
-        <w:pStyle w:val="Normal"/>
-        <w:bidi w:val="0"/>
-        <w:jc w:val="both"/>
-        <w:rPr>
-          <w:b/>
-          <w:b/>
-          <w:bCs/>
-        </w:rPr>
       </w:pPr>
       <w:r>
         <w:rPr>
@@ -60922,7 +61222,7 @@
           <w:bCs/>
         </w:rPr>
         <w:drawing>
-          <wp:anchor behindDoc="0" distT="0" distB="0" distL="0" distR="0" simplePos="0" locked="0" layoutInCell="0" allowOverlap="1" relativeHeight="5">
+          <wp:anchor behindDoc="0" distT="0" distB="0" distL="0" distR="0" simplePos="0" locked="0" layoutInCell="0" allowOverlap="1" relativeHeight="248">
             <wp:simplePos x="0" y="0"/>
             <wp:positionH relativeFrom="column">
               <wp:align>center</wp:align>
@@ -60933,7 +61233,7 @@
             <wp:extent cx="6120130" cy="4072890"/>
             <wp:effectExtent l="0" t="0" r="0" b="0"/>
             <wp:wrapSquare wrapText="largest"/>
-            <wp:docPr id="4" name="Imagen4" descr=""/>
+            <wp:docPr id="4" name="Imagen3" descr=""/>
             <wp:cNvGraphicFramePr>
               <a:graphicFrameLocks xmlns:a="http://schemas.openxmlformats.org/drawingml/2006/main" noChangeAspect="1"/>
             </wp:cNvGraphicFramePr>
@@ -60941,7 +61241,7 @@
               <a:graphicData uri="http://schemas.openxmlformats.org/drawingml/2006/picture">
                 <pic:pic xmlns:pic="http://schemas.openxmlformats.org/drawingml/2006/picture">
                   <pic:nvPicPr>
-                    <pic:cNvPr id="4" name="Imagen4" descr=""/>
+                    <pic:cNvPr id="4" name="Imagen3" descr=""/>
                     <pic:cNvPicPr>
                       <a:picLocks noChangeAspect="1" noChangeArrowheads="1"/>
                     </pic:cNvPicPr>
@@ -61072,7 +61372,7 @@
           <w:bCs w:val="false"/>
         </w:rPr>
         <w:drawing>
-          <wp:anchor behindDoc="0" distT="0" distB="0" distL="0" distR="0" simplePos="0" locked="0" layoutInCell="0" allowOverlap="1" relativeHeight="6">
+          <wp:anchor behindDoc="0" distT="0" distB="0" distL="0" distR="0" simplePos="0" locked="0" layoutInCell="0" allowOverlap="1" relativeHeight="249">
             <wp:simplePos x="0" y="0"/>
             <wp:positionH relativeFrom="column">
               <wp:align>center</wp:align>
@@ -61083,7 +61383,7 @@
             <wp:extent cx="6120130" cy="4072890"/>
             <wp:effectExtent l="0" t="0" r="0" b="0"/>
             <wp:wrapSquare wrapText="largest"/>
-            <wp:docPr id="5" name="Imagen5" descr=""/>
+            <wp:docPr id="5" name="Imagen4" descr=""/>
             <wp:cNvGraphicFramePr>
               <a:graphicFrameLocks xmlns:a="http://schemas.openxmlformats.org/drawingml/2006/main" noChangeAspect="1"/>
             </wp:cNvGraphicFramePr>
@@ -61091,7 +61391,7 @@
               <a:graphicData uri="http://schemas.openxmlformats.org/drawingml/2006/picture">
                 <pic:pic xmlns:pic="http://schemas.openxmlformats.org/drawingml/2006/picture">
                   <pic:nvPicPr>
-                    <pic:cNvPr id="5" name="Imagen5" descr=""/>
+                    <pic:cNvPr id="5" name="Imagen4" descr=""/>
                     <pic:cNvPicPr>
                       <a:picLocks noChangeAspect="1" noChangeArrowheads="1"/>
                     </pic:cNvPicPr>
@@ -61221,7 +61521,21 @@
           <w:b/>
           <w:bCs/>
         </w:rPr>
-        <w:t>Tabla 3.</w:t>
+        <w:t xml:space="preserve">Tabla </w:t>
+      </w:r>
+      <w:r>
+        <w:rPr>
+          <w:b/>
+          <w:bCs/>
+        </w:rPr>
+        <w:t>1</w:t>
+      </w:r>
+      <w:r>
+        <w:rPr>
+          <w:b/>
+          <w:bCs/>
+        </w:rPr>
+        <w:t>3.</w:t>
       </w:r>
       <w:r>
         <w:rPr>

</xml_diff>